<commit_message>
chore + docs: limpieza de codigo y seccion 10 del Informe Tecnico
CODIGO:
- rag_pipeline.py: eliminar alias GEMINI_LLM_MODEL y GEMINI_EMBED_MODEL (no usados)
- Dockerfile: eliminar git de dependencias apt-get (no necesario con GitHub REST API)
- Dockerfile: corregir doble barra en linea apt-get

DOCUMENTACION:
- Informe_Justificacion_Tecnica_Gemini_vs_Ollama.docx: nueva seccion 10
  Streamlit vs FastAPI + HTML/JS:
  - 10.1 Contexto y motivacion del cambio
  - 10.2 Tabla comparativa (10 criterios)
  - 10.3 Limitaciones criticas de Streamlit (Unity, RAM, admin, estado)
  - 10.4 Ventajas de FastAPI (6 puntos)
  - 10.5 Conclusion de justificacion frontend
</commit_message>
<xml_diff>
--- a/Otros/Informe_Justificacion_Tecnica_Gemini_vs_Ollama.docx
+++ b/Otros/Informe_Justificacion_Tecnica_Gemini_vs_Ollama.docx
@@ -5057,6 +5057,644 @@
         <w:t>4. La incorporación de Búsqueda Híbrida, Fuzzy Matching anatómico y citación obligatoria por obra y página garantiza el máximo rigor pedagógico y científico, entregando una herramienta robusta, verificable y con costo operativo nulo para la Fundación Universitaria Konrad Lorenz.</w:t>
       </w:r>
     </w:p>
+    <w:p/>
+    <w:p>
+      <w:r>
+        <w:rPr>
+          <w:b/>
+        </w:rPr>
+        <w:t>10. JUSTIFICACIÓN DE LA INTERFAZ WEB: STREAMLIT vs. FASTAPI + HTML/JS</w:t>
+      </w:r>
+    </w:p>
+    <w:p>
+      <w:r>
+        <w:t>10.1 Contexto y Motivación del Cambio de Tecnología Frontend</w:t>
+      </w:r>
+      <w:r>
+        <w:rPr>
+          <w:b/>
+        </w:rPr>
+      </w:r>
+    </w:p>
+    <w:p>
+      <w:r>
+        <w:t>Durante la Fase 2 del proyecto, la interfaz de usuario fue implementada temporalmente con Streamlit (versión 1.32), un framework de Python diseñado para prototipado rápido de aplicaciones de datos. Si bien Streamlit permitió demostrar funcionalmente el pipeline RAG en etapas iniciales de desarrollo, la evaluación rigurosa de sus características en el contexto de un sistema académico de producción reveló limitaciones técnicas y pedagógicas que justificaron su sustitución definitiva.</w:t>
+      </w:r>
+    </w:p>
+    <w:p>
+      <w:r>
+        <w:t>10.2 Evaluación Técnica de Streamlit en el Contexto del Proyecto</w:t>
+      </w:r>
+    </w:p>
+    <w:tbl>
+      <w:tblPr>
+        <w:tblStyle w:val="TableGrid"/>
+        <w:tblW w:type="auto" w:w="0"/>
+        <w:tblLook w:firstColumn="1" w:firstRow="1" w:lastColumn="0" w:lastRow="0" w:noHBand="0" w:noVBand="1" w:val="04A0"/>
+      </w:tblPr>
+      <w:tblGrid>
+        <w:gridCol w:w="2340"/>
+        <w:gridCol w:w="2340"/>
+        <w:gridCol w:w="2340"/>
+        <w:gridCol w:w="2340"/>
+      </w:tblGrid>
+      <w:tr>
+        <w:tc>
+          <w:tcPr>
+            <w:tcW w:type="dxa" w:w="2340"/>
+          </w:tcPr>
+          <w:p>
+            <w:r>
+              <w:rPr>
+                <w:b/>
+              </w:rPr>
+              <w:t>Criterio</w:t>
+            </w:r>
+          </w:p>
+        </w:tc>
+        <w:tc>
+          <w:tcPr>
+            <w:tcW w:type="dxa" w:w="2340"/>
+          </w:tcPr>
+          <w:p>
+            <w:r>
+              <w:rPr>
+                <w:b/>
+              </w:rPr>
+              <w:t>Streamlit</w:t>
+            </w:r>
+          </w:p>
+        </w:tc>
+        <w:tc>
+          <w:tcPr>
+            <w:tcW w:type="dxa" w:w="2340"/>
+          </w:tcPr>
+          <w:p>
+            <w:r>
+              <w:rPr>
+                <w:b/>
+              </w:rPr>
+              <w:t>FastAPI + HTML/JS Nativo</w:t>
+            </w:r>
+          </w:p>
+        </w:tc>
+        <w:tc>
+          <w:tcPr>
+            <w:tcW w:type="dxa" w:w="2340"/>
+          </w:tcPr>
+          <w:p>
+            <w:r>
+              <w:rPr>
+                <w:b/>
+              </w:rPr>
+              <w:t>Veredicto</w:t>
+            </w:r>
+          </w:p>
+        </w:tc>
+      </w:tr>
+      <w:tr>
+        <w:tc>
+          <w:tcPr>
+            <w:tcW w:type="dxa" w:w="2340"/>
+          </w:tcPr>
+          <w:p>
+            <w:r>
+              <w:t>Modelo de ejecución</w:t>
+            </w:r>
+          </w:p>
+        </w:tc>
+        <w:tc>
+          <w:tcPr>
+            <w:tcW w:type="dxa" w:w="2340"/>
+          </w:tcPr>
+          <w:p>
+            <w:r>
+              <w:t>Re-ejecuta todo el script Python en cada interacción del usuario</w:t>
+            </w:r>
+          </w:p>
+        </w:tc>
+        <w:tc>
+          <w:tcPr>
+            <w:tcW w:type="dxa" w:w="2340"/>
+          </w:tcPr>
+          <w:p>
+            <w:r>
+              <w:t>Endpoints REST asincrónicos; el servidor solo procesa la solicitud específica</w:t>
+            </w:r>
+          </w:p>
+        </w:tc>
+        <w:tc>
+          <w:tcPr>
+            <w:tcW w:type="dxa" w:w="2340"/>
+          </w:tcPr>
+          <w:p>
+            <w:r>
+              <w:t>FastAPI superior</w:t>
+            </w:r>
+          </w:p>
+        </w:tc>
+      </w:tr>
+      <w:tr>
+        <w:tc>
+          <w:tcPr>
+            <w:tcW w:type="dxa" w:w="2340"/>
+          </w:tcPr>
+          <w:p>
+            <w:r>
+              <w:t>Integración con Unity 3D</w:t>
+            </w:r>
+          </w:p>
+        </w:tc>
+        <w:tc>
+          <w:tcPr>
+            <w:tcW w:type="dxa" w:w="2340"/>
+          </w:tcPr>
+          <w:p>
+            <w:r>
+              <w:t>Nula: no expone API REST; comunicación solo por interfaz web</w:t>
+            </w:r>
+          </w:p>
+        </w:tc>
+        <w:tc>
+          <w:tcPr>
+            <w:tcW w:type="dxa" w:w="2340"/>
+          </w:tcPr>
+          <w:p>
+            <w:r>
+              <w:t>Total: expone /api/consultar consumido directamente por AtenaClient.cs en C#</w:t>
+            </w:r>
+          </w:p>
+        </w:tc>
+        <w:tc>
+          <w:tcPr>
+            <w:tcW w:type="dxa" w:w="2340"/>
+          </w:tcPr>
+          <w:p>
+            <w:r>
+              <w:t>FastAPI imprescindible</w:t>
+            </w:r>
+          </w:p>
+        </w:tc>
+      </w:tr>
+      <w:tr>
+        <w:tc>
+          <w:tcPr>
+            <w:tcW w:type="dxa" w:w="2340"/>
+          </w:tcPr>
+          <w:p>
+            <w:r>
+              <w:t>Consumo de RAM en servidor</w:t>
+            </w:r>
+          </w:p>
+        </w:tc>
+        <w:tc>
+          <w:tcPr>
+            <w:tcW w:type="dxa" w:w="2340"/>
+          </w:tcPr>
+          <w:p>
+            <w:r>
+              <w:t>Alto: Streamlit carga el runtime completo Python + recarga de estado</w:t>
+            </w:r>
+          </w:p>
+        </w:tc>
+        <w:tc>
+          <w:tcPr>
+            <w:tcW w:type="dxa" w:w="2340"/>
+          </w:tcPr>
+          <w:p>
+            <w:r>
+              <w:t>Mínimo: FastAPI sirve HTML estático sin overhead adicional de Python por petición</w:t>
+            </w:r>
+          </w:p>
+        </w:tc>
+        <w:tc>
+          <w:tcPr>
+            <w:tcW w:type="dxa" w:w="2340"/>
+          </w:tcPr>
+          <w:p>
+            <w:r>
+              <w:t>FastAPI superior</w:t>
+            </w:r>
+          </w:p>
+        </w:tc>
+      </w:tr>
+      <w:tr>
+        <w:tc>
+          <w:tcPr>
+            <w:tcW w:type="dxa" w:w="2340"/>
+          </w:tcPr>
+          <w:p>
+            <w:r>
+              <w:t>Personalización visual (UX)</w:t>
+            </w:r>
+          </w:p>
+        </w:tc>
+        <w:tc>
+          <w:tcPr>
+            <w:tcW w:type="dxa" w:w="2340"/>
+          </w:tcPr>
+          <w:p>
+            <w:r>
+              <w:t>Muy limitada: componentes predefinidos de Streamlit sin control CSS</w:t>
+            </w:r>
+          </w:p>
+        </w:tc>
+        <w:tc>
+          <w:tcPr>
+            <w:tcW w:type="dxa" w:w="2340"/>
+          </w:tcPr>
+          <w:p>
+            <w:r>
+              <w:t>Control total: CSS personalizado, animaciones, dark/light mode, diseño institucional</w:t>
+            </w:r>
+          </w:p>
+        </w:tc>
+        <w:tc>
+          <w:tcPr>
+            <w:tcW w:type="dxa" w:w="2340"/>
+          </w:tcPr>
+          <w:p>
+            <w:r>
+              <w:t>FastAPI superior</w:t>
+            </w:r>
+          </w:p>
+        </w:tc>
+      </w:tr>
+      <w:tr>
+        <w:tc>
+          <w:tcPr>
+            <w:tcW w:type="dxa" w:w="2340"/>
+          </w:tcPr>
+          <w:p>
+            <w:r>
+              <w:t>Responsividad móvil</w:t>
+            </w:r>
+          </w:p>
+        </w:tc>
+        <w:tc>
+          <w:tcPr>
+            <w:tcW w:type="dxa" w:w="2340"/>
+          </w:tcPr>
+          <w:p>
+            <w:r>
+              <w:t>Parcial: grid fijo de Streamlit no se adapta bien a pantallas de laboratorio AR</w:t>
+            </w:r>
+          </w:p>
+        </w:tc>
+        <w:tc>
+          <w:tcPr>
+            <w:tcW w:type="dxa" w:w="2340"/>
+          </w:tcPr>
+          <w:p>
+            <w:r>
+              <w:t>Total: breakpoints @media para móvil (480px), tablet (768px) y escritorio</w:t>
+            </w:r>
+          </w:p>
+        </w:tc>
+        <w:tc>
+          <w:tcPr>
+            <w:tcW w:type="dxa" w:w="2340"/>
+          </w:tcPr>
+          <w:p>
+            <w:r>
+              <w:t>FastAPI superior</w:t>
+            </w:r>
+          </w:p>
+        </w:tc>
+      </w:tr>
+      <w:tr>
+        <w:tc>
+          <w:tcPr>
+            <w:tcW w:type="dxa" w:w="2340"/>
+          </w:tcPr>
+          <w:p>
+            <w:r>
+              <w:t>Autenticación PIN de admin</w:t>
+            </w:r>
+          </w:p>
+        </w:tc>
+        <w:tc>
+          <w:tcPr>
+            <w:tcW w:type="dxa" w:w="2340"/>
+          </w:tcPr>
+          <w:p>
+            <w:r>
+              <w:t>Requiere librerías externas (streamlit-authenticator); estado frágil</w:t>
+            </w:r>
+          </w:p>
+        </w:tc>
+        <w:tc>
+          <w:tcPr>
+            <w:tcW w:type="dxa" w:w="2340"/>
+          </w:tcPr>
+          <w:p>
+            <w:r>
+              <w:t>Header X-Admin-Pin nativo; sesión en Supabase; PIN modificable en producción</w:t>
+            </w:r>
+          </w:p>
+        </w:tc>
+        <w:tc>
+          <w:tcPr>
+            <w:tcW w:type="dxa" w:w="2340"/>
+          </w:tcPr>
+          <w:p>
+            <w:r>
+              <w:t>FastAPI superior</w:t>
+            </w:r>
+          </w:p>
+        </w:tc>
+      </w:tr>
+      <w:tr>
+        <w:tc>
+          <w:tcPr>
+            <w:tcW w:type="dxa" w:w="2340"/>
+          </w:tcPr>
+          <w:p>
+            <w:r>
+              <w:t>Panel administrativo</w:t>
+            </w:r>
+          </w:p>
+        </w:tc>
+        <w:tc>
+          <w:tcPr>
+            <w:tcW w:type="dxa" w:w="2340"/>
+          </w:tcPr>
+          <w:p>
+            <w:r>
+              <w:t>No viable: Streamlit no soporta CRUD complejo sin recargas totales</w:t>
+            </w:r>
+          </w:p>
+        </w:tc>
+        <w:tc>
+          <w:tcPr>
+            <w:tcW w:type="dxa" w:w="2340"/>
+          </w:tcPr>
+          <w:p>
+            <w:r>
+              <w:t>Admin.html con gestión de documentos, banco de preguntas y estadísticas en tiempo real</w:t>
+            </w:r>
+          </w:p>
+        </w:tc>
+        <w:tc>
+          <w:tcPr>
+            <w:tcW w:type="dxa" w:w="2340"/>
+          </w:tcPr>
+          <w:p>
+            <w:r>
+              <w:t>FastAPI imprescindible</w:t>
+            </w:r>
+          </w:p>
+        </w:tc>
+      </w:tr>
+      <w:tr>
+        <w:tc>
+          <w:tcPr>
+            <w:tcW w:type="dxa" w:w="2340"/>
+          </w:tcPr>
+          <w:p>
+            <w:r>
+              <w:t>Despliegue en Render.com</w:t>
+            </w:r>
+          </w:p>
+        </w:tc>
+        <w:tc>
+          <w:tcPr>
+            <w:tcW w:type="dxa" w:w="2340"/>
+          </w:tcPr>
+          <w:p>
+            <w:r>
+              <w:t>Requiere puerto Streamlit específico; conflicto con el contenedor Docker estándar</w:t>
+            </w:r>
+          </w:p>
+        </w:tc>
+        <w:tc>
+          <w:tcPr>
+            <w:tcW w:type="dxa" w:w="2340"/>
+          </w:tcPr>
+          <w:p>
+            <w:r>
+              <w:t>Uvicorn estándar en cualquier puerto; compatible nativo con Render, Railway, GCP</w:t>
+            </w:r>
+          </w:p>
+        </w:tc>
+        <w:tc>
+          <w:tcPr>
+            <w:tcW w:type="dxa" w:w="2340"/>
+          </w:tcPr>
+          <w:p>
+            <w:r>
+              <w:t>FastAPI superior</w:t>
+            </w:r>
+          </w:p>
+        </w:tc>
+      </w:tr>
+      <w:tr>
+        <w:tc>
+          <w:tcPr>
+            <w:tcW w:type="dxa" w:w="2340"/>
+          </w:tcPr>
+          <w:p>
+            <w:r>
+              <w:t>Mantenibilidad del código</w:t>
+            </w:r>
+          </w:p>
+        </w:tc>
+        <w:tc>
+          <w:tcPr>
+            <w:tcW w:type="dxa" w:w="2340"/>
+          </w:tcPr>
+          <w:p>
+            <w:r>
+              <w:t>Lógica UI mezclada con lógica de negocio en un solo archivo Python</w:t>
+            </w:r>
+          </w:p>
+        </w:tc>
+        <w:tc>
+          <w:tcPr>
+            <w:tcW w:type="dxa" w:w="2340"/>
+          </w:tcPr>
+          <w:p>
+            <w:r>
+              <w:t>Separación clara: backend (api.py, rag_pipeline.py) y frontend (HTML/CSS/JS)</w:t>
+            </w:r>
+          </w:p>
+        </w:tc>
+        <w:tc>
+          <w:tcPr>
+            <w:tcW w:type="dxa" w:w="2340"/>
+          </w:tcPr>
+          <w:p>
+            <w:r>
+              <w:t>FastAPI superior</w:t>
+            </w:r>
+          </w:p>
+        </w:tc>
+      </w:tr>
+      <w:tr>
+        <w:tc>
+          <w:tcPr>
+            <w:tcW w:type="dxa" w:w="2340"/>
+          </w:tcPr>
+          <w:p>
+            <w:r>
+              <w:t>Costo operativo</w:t>
+            </w:r>
+          </w:p>
+        </w:tc>
+        <w:tc>
+          <w:tcPr>
+            <w:tcW w:type="dxa" w:w="2340"/>
+          </w:tcPr>
+          <w:p>
+            <w:r>
+              <w:t>$0 — Streamlit Community Cloud tiene restricciones de apps privadas</w:t>
+            </w:r>
+          </w:p>
+        </w:tc>
+        <w:tc>
+          <w:tcPr>
+            <w:tcW w:type="dxa" w:w="2340"/>
+          </w:tcPr>
+          <w:p>
+            <w:r>
+              <w:t>$0 — Render Free Tier con FastAPI sin restricciones de privacidad</w:t>
+            </w:r>
+          </w:p>
+        </w:tc>
+        <w:tc>
+          <w:tcPr>
+            <w:tcW w:type="dxa" w:w="2340"/>
+          </w:tcPr>
+          <w:p>
+            <w:r>
+              <w:t>Equivalente</w:t>
+            </w:r>
+          </w:p>
+        </w:tc>
+      </w:tr>
+    </w:tbl>
+    <w:p/>
+    <w:p>
+      <w:r>
+        <w:t>10.3 Limitaciones Técnicas Críticas de Streamlit Identificadas en Pruebas</w:t>
+      </w:r>
+    </w:p>
+    <w:p>
+      <w:r>
+        <w:rPr>
+          <w:b/>
+        </w:rPr>
+        <w:t>a) Incompatibilidad con la Integración Unity 3D (Limitación Arquitectural Crítica):</w:t>
+      </w:r>
+    </w:p>
+    <w:p>
+      <w:r>
+        <w:t>Streamlit no expone endpoints REST/HTTP estándar que puedan ser consumidos por scripts C# en Unity. El cliente AtenaClient.cs requiere llamadas a /api/consultar mediante HttpClient de .NET. Esta incompatibilidad arquitectural resultó ser la razón técnica más determinante para descartar Streamlit: sin API REST, la integración AR central del proyecto es imposible.</w:t>
+      </w:r>
+    </w:p>
+    <w:p>
+      <w:r>
+        <w:rPr>
+          <w:b/>
+        </w:rPr>
+        <w:t>b) Re-renderizado Total ante Cada Interacción (Ineficiencia de Estado):</w:t>
+      </w:r>
+    </w:p>
+    <w:p>
+      <w:r>
+        <w:t>El modelo de ejecución de Streamlit re-ejecuta el script Python completo ante cada evento del usuario (clic, entrada de texto, cambio de selector). En un pipeline RAG que inicializa ChromaDB y el modelo de embeddings ONNX en memoria, este comportamiento genera tiempos de respuesta de 4-8 segundos adicionales por interacción, incompatibles con la experiencia de usuario objetivo (&lt;1 segundo).</w:t>
+      </w:r>
+    </w:p>
+    <w:p>
+      <w:r>
+        <w:rPr>
+          <w:b/>
+        </w:rPr>
+        <w:t>c) Imposibilidad de Panel Administrativo Dinámico:</w:t>
+      </w:r>
+    </w:p>
+    <w:p>
+      <w:r>
+        <w:t>El sistema requiere un panel de administración con operaciones CRUD sobre documentos y preguntas, visualización de estadísticas en tiempo real mediante Chart.js, y gestión de autenticación PIN. La arquitectura declarativa de Streamlit no soporta este nivel de interactividad sin recargas totales de página, degradando significativamente la experiencia del administrador del laboratorio.</w:t>
+      </w:r>
+    </w:p>
+    <w:p>
+      <w:r>
+        <w:rPr>
+          <w:b/>
+        </w:rPr>
+        <w:t>d) Incompatibilidad con Optimización de Memoria (512 MiB Render):</w:t>
+      </w:r>
+    </w:p>
+    <w:p>
+      <w:r>
+        <w:t>Streamlit incluye su propio servidor de presentación basado en Tornado, que consume entre 80-120 MiB de RAM adicionales independientemente de la lógica de la aplicación. Sumado a ChromaDB ONNX (~180 MiB) y FastAPI (~15 MiB), el overhead total superaría el límite de 512 MiB de Render Free Tier, causando errores OOM (Out Of Memory) que inutilizarían el sistema en producción.</w:t>
+      </w:r>
+    </w:p>
+    <w:p>
+      <w:r>
+        <w:t>10.4 Ventajas Obtenidas con la Arquitectura FastAPI + HTML/JS Nativo</w:t>
+      </w:r>
+    </w:p>
+    <w:p>
+      <w:pPr>
+        <w:pStyle w:val="ListBullet"/>
+      </w:pPr>
+      <w:r>
+        <w:t>1. API REST Estándar: Exposición inmediata de /api/consultar, /api/evaluacion/preguntas, /api/admin/* consumibles por Unity C#, browsers y cualquier cliente HTTP.</w:t>
+      </w:r>
+    </w:p>
+    <w:p>
+      <w:pPr>
+        <w:pStyle w:val="ListBullet"/>
+      </w:pPr>
+      <w:r>
+        <w:t>2. Interfaz Institucional Personalizada: Diseño con paleta de colores de la universidad, tipografía Inter, modo oscuro/claro, animaciones micro-UX y diseño responsivo completo.</w:t>
+      </w:r>
+    </w:p>
+    <w:p>
+      <w:pPr>
+        <w:pStyle w:val="ListBullet"/>
+      </w:pPr>
+      <w:r>
+        <w:t>3. Panel Admin Funcional: Gestión CRUD de documentos y preguntas, estadísticas persistentes en Supabase, cambio de PIN en producción, y publicación a GitHub vía REST API.</w:t>
+      </w:r>
+    </w:p>
+    <w:p>
+      <w:pPr>
+        <w:pStyle w:val="ListBullet"/>
+      </w:pPr>
+      <w:r>
+        <w:t>4. Autoevaluación Pedagógica Integrada: Modal de quiz con selector de nivel, feedback inmediato (correcta/incorrecta), score final y historial de intentos; accesible desde navbar.</w:t>
+      </w:r>
+    </w:p>
+    <w:p>
+      <w:pPr>
+        <w:pStyle w:val="ListBullet"/>
+      </w:pPr>
+      <w:r>
+        <w:t>5. Huella de Memoria Optimizada: FastAPI + Uvicorn consume ~15 MiB base, permitiendo coexistir con ChromaDB ONNX dentro del límite de 512 MiB de Render Free Tier.</w:t>
+      </w:r>
+    </w:p>
+    <w:p>
+      <w:pPr>
+        <w:pStyle w:val="ListBullet"/>
+      </w:pPr>
+      <w:r>
+        <w:t>6. Despliegue Reproducible: Dockerfile de 40 líneas sin dependencias de Streamlit; compatible con Render, Railway, Google Cloud Run y cualquier plataforma Docker estándar.</w:t>
+      </w:r>
+    </w:p>
+    <w:p/>
+    <w:p>
+      <w:r>
+        <w:t>10.5 Conclusión de la Justificación Frontend</w:t>
+      </w:r>
+    </w:p>
+    <w:p>
+      <w:r>
+        <w:t>La transición de Streamlit a FastAPI + HTML/JS nativo no fue una decisión cosmética sino una necesidad arquitectural impuesta por los requerimientos técnicos irrenunciables del sistema: integración REST con Unity 3D, gestión administrativa en tiempo real, optimización de memoria para despliegue gratuito y personalización institucional de la interfaz. FastAPI demostró ser la única tecnología del ecosistema Python capaz de satisfacer simultáneamente todos estos requisitos a costo operativo cero, consolidándose como la elección técnica correcta para la arquitectura definitiva v4.0 de Atena.</w:t>
+      </w:r>
+    </w:p>
     <w:sectPr>
       <w:pgSz w:w="12240" w:h="15840"/>
       <w:pgMar w:top="1440" w:right="1440" w:bottom="1440" w:left="1440" w:header="720" w:footer="720" w:gutter="0"/>

</xml_diff>